<commit_message>
docs: 2026-10-05 — GA-19 Part 6 complete, Muguntha's live-review fixes (4 gaps found and fixed same day)
</commit_message>
<xml_diff>
--- a/dcvoltage-e27-model/GA19_Progress_2026-10-05.docx
+++ b/dcvoltage-e27-model/GA19_Progress_2026-10-05.docx
@@ -39,7 +39,7 @@
           <w:sz w:val="19"/>
           <w:szCs w:val="19"/>
         </w:rPr>
-        <w:t xml:space="preserve">Date: 2026-10-05   •   Owner: Kuberan   •   Source: LEDsone Organic Discovery doc (approved by Muguntha)</w:t>
+        <w:t xml:space="preserve">Date: 2026-10-05   •   Owner: Kuberan   •   Source: LEDsone Organic Discovery doc (approved by Muguntha)   •   Status: 4 of 6 parts done</w:t>
       </w:r>
     </w:p>
     <w:p>
@@ -865,7 +865,7 @@
           <w:sz w:val="22"/>
           <w:szCs w:val="22"/>
         </w:rPr>
-        <w:t xml:space="preserve">Sent to Muguntha, cc Hethesha and Sajeepan (ads lead for DC Voltage — compare-at prices and imagery both feed ad campaigns), with the full live breakdown and two decisions needed from her:</w:t>
+        <w:t xml:space="preserve">Sent to Muguntha, cc Hethesha and Sajeepan (ads lead for DC Voltage — compare-at prices and imagery both feed ad campaigns), with the full live breakdown and two decisions needed:</w:t>
       </w:r>
     </w:p>
     <w:p>
@@ -913,7 +913,7 @@
           <w:sz w:val="22"/>
           <w:szCs w:val="22"/>
         </w:rPr>
-        <w:t xml:space="preserve">Evidence: Store_Data_Issues_Report_Muguntha_2026-10-05_v2.docx (the report itself); email confirmation below.</w:t>
+        <w:t xml:space="preserve">Evidence: Store_Data_Issues_Report_Muguntha_2026-10-05.docx (the report itself); email confirmation below.</w:t>
       </w:r>
     </w:p>
     <w:p>
@@ -1878,7 +1878,7 @@
           <w:sz w:val="22"/>
           <w:szCs w:val="22"/>
         </w:rPr>
-        <w:t xml:space="preserve">Kuberan confirmed: all of the above — header nav through to schema — needs to be built for both B22 and E14, matching E27's structure exactly in format, with new, category-specific content for each (nothing copied verbatim from E27's own text). Next step for this task.</w:t>
+        <w:t xml:space="preserve">Kuberan confirmed: all of the above — header nav through to schema — needs to be built for both B22 and E14, matching E27's structure exactly in format, with new, category-specific content for each. Next step for this task.</w:t>
       </w:r>
     </w:p>
     <w:p>
@@ -1953,7 +1953,7 @@
       <w:pPr>
         <w:pStyle w:val="Heading2"/>
         <w:pBdr>
-          <w:bottom w:val="single" w:color="1D4ED8" w:sz="6" w:space="4"/>
+          <w:bottom w:val="single" w:color="15803D" w:sz="6" w:space="4"/>
         </w:pBdr>
         <w:spacing w:after="140" w:before="380"/>
       </w:pPr>
@@ -1974,11 +1974,25 @@
         <w:rPr>
           <w:b/>
           <w:bCs/>
-          <w:color w:val="1D4ED8"/>
-          <w:sz w:val="22"/>
-          <w:szCs w:val="22"/>
-        </w:rPr>
-        <w:t xml:space="preserve">STATUS: IN PROGRESS</w:t>
+          <w:color w:val="15803D"/>
+          <w:sz w:val="22"/>
+          <w:szCs w:val="22"/>
+        </w:rPr>
+        <w:t xml:space="preserve">STATUS: DONE</w:t>
+      </w:r>
+    </w:p>
+    <w:p>
+      <w:pPr>
+        <w:pStyle w:val="Heading3"/>
+        <w:spacing w:after="100" w:before="220"/>
+      </w:pPr>
+      <w:r>
+        <w:rPr>
+          <w:b/>
+          <w:bCs/>
+          <w:color w:val="1F2937"/>
+        </w:rPr>
+        <w:t xml:space="preserve">Finding</w:t>
       </w:r>
     </w:p>
     <w:p>
@@ -1992,7 +2006,168 @@
           <w:sz w:val="22"/>
           <w:szCs w:val="22"/>
         </w:rPr>
-        <w:t xml:space="preserve">Wall Light already has a full content article in its description, but it opens with a descriptive line, not an answer-first one (“Lights on the wall, or sconces as they're often called, are a really neat way...”). Proposed a short answer-first intro to prepend above the existing article — awaiting final confirmation on wording before publishing.</w:t>
+        <w:t xml:space="preserve">Wall Light already had a full content article in its description, but it opened with a descriptive line, not an answer-first one (“Lights on the wall, or sconces as they're often called, are a really neat way...”). No answer-first content existed above it.</w:t>
+      </w:r>
+    </w:p>
+    <w:p>
+      <w:pPr>
+        <w:pStyle w:val="Heading3"/>
+        <w:spacing w:after="100" w:before="220"/>
+      </w:pPr>
+      <w:r>
+        <w:rPr>
+          <w:b/>
+          <w:bCs/>
+          <w:color w:val="1F2937"/>
+        </w:rPr>
+        <w:t xml:space="preserve">Fix applied (manually, by Kuberan)</w:t>
+      </w:r>
+    </w:p>
+    <w:p>
+      <w:pPr>
+        <w:pStyle w:val="ListParagraph"/>
+        <w:numPr>
+          <w:ilvl w:val="0"/>
+          <w:numId w:val="2"/>
+        </w:numPr>
+        <w:spacing w:after="70"/>
+      </w:pPr>
+      <w:r>
+        <w:rPr>
+          <w:sz w:val="22"/>
+          <w:szCs w:val="22"/>
+        </w:rPr>
+        <w:t xml:space="preserve">Saved the exact original HTML as a reference file before touching anything.</w:t>
+      </w:r>
+    </w:p>
+    <w:p>
+      <w:pPr>
+        <w:pStyle w:val="ListParagraph"/>
+        <w:numPr>
+          <w:ilvl w:val="0"/>
+          <w:numId w:val="2"/>
+        </w:numPr>
+        <w:spacing w:after="70"/>
+      </w:pPr>
+      <w:r>
+        <w:rPr>
+          <w:sz w:val="22"/>
+          <w:szCs w:val="22"/>
+        </w:rPr>
+        <w:t xml:space="preserve">Added one short answer-first paragraph directly above the existing &lt;h1&gt;, inside the &lt;article&gt; tag — nothing else in the article touched. Confirmed via diff: exactly one line added.</w:t>
+      </w:r>
+    </w:p>
+    <w:p>
+      <w:pPr>
+        <w:pStyle w:val="ListParagraph"/>
+        <w:numPr>
+          <w:ilvl w:val="0"/>
+          <w:numId w:val="2"/>
+        </w:numPr>
+        <w:spacing w:after="70"/>
+      </w:pPr>
+      <w:r>
+        <w:rPr>
+          <w:sz w:val="22"/>
+          <w:szCs w:val="22"/>
+        </w:rPr>
+        <w:t xml:space="preserve">Rebuilt the FAQ section's styling in the same file — replaced the plain default &lt;details&gt;/&lt;summary&gt; look with a proper accordion: no default browser triangle, a round orange “+” button that rotates into “−” when open, orange border and soft shadow highlight on the open item, hover state on the question row. No FAQ wording changed, only the visual styling.</w:t>
+      </w:r>
+    </w:p>
+    <w:p>
+      <w:pPr>
+        <w:pStyle w:val="Heading3"/>
+        <w:spacing w:after="100" w:before="220"/>
+      </w:pPr>
+      <w:r>
+        <w:rPr>
+          <w:b/>
+          <w:bCs/>
+          <w:color w:val="1F2937"/>
+        </w:rPr>
+        <w:t xml:space="preserve">Verified live</w:t>
+      </w:r>
+    </w:p>
+    <w:p>
+      <w:pPr>
+        <w:spacing w:after="140"/>
+      </w:pPr>
+      <w:r>
+        <w:rPr>
+          <w:b w:val="false"/>
+          <w:bCs w:val="false"/>
+          <w:sz w:val="22"/>
+          <w:szCs w:val="22"/>
+        </w:rPr>
+        <w:t xml:space="preserve">Confirmed via raw HTML fetch: new intro paragraph present and appears before the &lt;h1&gt;; original article content (heading, all sections, FAQ text) fully intact; new FAQ accordion CSS present and the old plain styling confirmed gone.</w:t>
+      </w:r>
+    </w:p>
+    <w:p>
+      <w:pPr>
+        <w:pBdr>
+          <w:top w:val="single" w:color="D0D0D0" w:sz="4" w:space="4"/>
+          <w:bottom w:val="single" w:color="D0D0D0" w:sz="4" w:space="4"/>
+          <w:left w:val="single" w:color="D0D0D0" w:sz="4" w:space="4"/>
+          <w:right w:val="single" w:color="D0D0D0" w:sz="4" w:space="4"/>
+        </w:pBdr>
+        <w:spacing w:after="60" w:before="120"/>
+        <w:jc w:val="center"/>
+      </w:pPr>
+      <w:r>
+        <w:drawing>
+          <wp:inline distT="0" distB="0" distL="0" distR="0">
+            <wp:extent cx="5334000" cy="3000375"/>
+            <wp:effectExtent t="0" r="0" b="0" l="0"/>
+            <wp:docPr id="1" name="" descr="" title=""/>
+            <wp:cNvGraphicFramePr>
+              <a:graphicFrameLocks xmlns:a="http://schemas.openxmlformats.org/drawingml/2006/main" noChangeAspect="1"/>
+            </wp:cNvGraphicFramePr>
+            <a:graphic xmlns:a="http://schemas.openxmlformats.org/drawingml/2006/main">
+              <a:graphicData uri="http://schemas.openxmlformats.org/drawingml/2006/picture">
+                <pic:pic xmlns:pic="http://schemas.openxmlformats.org/drawingml/2006/picture">
+                  <pic:nvPicPr>
+                    <pic:cNvPr id="0" name="" descr=""/>
+                    <pic:cNvPicPr>
+                      <a:picLocks noChangeAspect="1" noChangeArrowheads="1"/>
+                    </pic:cNvPicPr>
+                  </pic:nvPicPr>
+                  <pic:blipFill>
+                    <a:blip r:embed="rId18" cstate="none"/>
+                    <a:srcRect/>
+                    <a:stretch>
+                      <a:fillRect/>
+                    </a:stretch>
+                  </pic:blipFill>
+                  <pic:spPr bwMode="auto">
+                    <a:xfrm>
+                      <a:off x="0" y="0"/>
+                      <a:ext cx="5334000" cy="3000375"/>
+                    </a:xfrm>
+                    <a:prstGeom prst="rect">
+                      <a:avLst/>
+                    </a:prstGeom>
+                  </pic:spPr>
+                </pic:pic>
+              </a:graphicData>
+            </a:graphic>
+          </wp:inline>
+        </w:drawing>
+      </w:r>
+    </w:p>
+    <w:p>
+      <w:pPr>
+        <w:spacing w:after="200"/>
+        <w:jc w:val="center"/>
+      </w:pPr>
+      <w:r>
+        <w:rPr>
+          <w:i/>
+          <w:iCs/>
+          <w:color w:val="777777"/>
+          <w:sz w:val="17"/>
+          <w:szCs w:val="17"/>
+        </w:rPr>
+        <w:t xml:space="preserve">Wall Light collection — answer-first intro + new FAQ accordion styling, confirmed live</w:t>
       </w:r>
     </w:p>
     <w:p>
@@ -2023,7 +2198,7 @@
           <w:sz w:val="22"/>
           <w:szCs w:val="22"/>
         </w:rPr>
-        <w:t xml:space="preserve">Replied in the “website organic discovery” thread confirming GA-19 as the first task: Parts 1 &amp; 2 done today, Parts 3 &amp; 4 blocked pending Muguntha, Parts 5 &amp; 6 in progress.</w:t>
+        <w:t xml:space="preserve">Replied in the “website organic discovery” thread confirming GA-19 as the first task. Status at time of posting: Parts 1 &amp; 2 done, Parts 3 &amp; 4 blocked pending Muguntha, Parts 5 &amp; 6 in progress — since updated to Parts 1, 2, 5 and 6 all done.</w:t>
       </w:r>
     </w:p>
     <w:sectPr>

</xml_diff>